<commit_message>
added new ship movement using accelration rates and deceleration rates and fixed window collision
</commit_message>
<xml_diff>
--- a/Asteroids (Homework 4) design doc.docx
+++ b/Asteroids (Homework 4) design doc.docx
@@ -7,7 +7,10 @@
         <w:pStyle w:val="Title"/>
       </w:pPr>
       <w:r>
-        <w:t>Asteroids(Homework 4)</w:t>
+        <w:t>Asteroids (</w:t>
+      </w:r>
+      <w:r>
+        <w:t>Homework 4)</w:t>
       </w:r>
     </w:p>
     <w:p>
@@ -337,6 +340,108 @@
       <w:pPr>
         <w:ind w:left="360"/>
       </w:pPr>
+      <w:r>
+        <w:t>The game manager class contains</w:t>
+      </w:r>
+      <w:r>
+        <w:t>:</w:t>
+      </w:r>
+    </w:p>
+    <w:p>
+      <w:pPr>
+        <w:pStyle w:val="ListParagraph"/>
+        <w:numPr>
+          <w:ilvl w:val="0"/>
+          <w:numId w:val="1"/>
+        </w:numPr>
+      </w:pPr>
+      <w:r>
+        <w:t xml:space="preserve"> </w:t>
+      </w:r>
+      <w:r>
+        <w:t>pools</w:t>
+      </w:r>
+      <w:r>
+        <w:t xml:space="preserve"> for the various objects in the game such as bullets asteroids and </w:t>
+      </w:r>
+      <w:r>
+        <w:t>background pieces.</w:t>
+      </w:r>
+    </w:p>
+    <w:p>
+      <w:pPr>
+        <w:pStyle w:val="ListParagraph"/>
+        <w:numPr>
+          <w:ilvl w:val="0"/>
+          <w:numId w:val="1"/>
+        </w:numPr>
+      </w:pPr>
+      <w:r>
+        <w:t xml:space="preserve"> </w:t>
+      </w:r>
+      <w:r>
+        <w:t>the</w:t>
+      </w:r>
+      <w:r>
+        <w:t xml:space="preserve"> main update and render function calls</w:t>
+      </w:r>
+    </w:p>
+    <w:p>
+      <w:pPr>
+        <w:pStyle w:val="ListParagraph"/>
+        <w:numPr>
+          <w:ilvl w:val="0"/>
+          <w:numId w:val="1"/>
+        </w:numPr>
+      </w:pPr>
+      <w:r>
+        <w:t xml:space="preserve"> logic used to control the game state of the game </w:t>
+      </w:r>
+    </w:p>
+    <w:p>
+      <w:pPr>
+        <w:pStyle w:val="ListParagraph"/>
+        <w:numPr>
+          <w:ilvl w:val="0"/>
+          <w:numId w:val="1"/>
+        </w:numPr>
+      </w:pPr>
+      <w:r>
+        <w:t>Textures used for the various sprites of the game and the file path for loading them</w:t>
+      </w:r>
+    </w:p>
+    <w:p>
+      <w:pPr>
+        <w:pStyle w:val="ListParagraph"/>
+        <w:numPr>
+          <w:ilvl w:val="0"/>
+          <w:numId w:val="1"/>
+        </w:numPr>
+      </w:pPr>
+      <w:r>
+        <w:t xml:space="preserve">The main render window and size variables </w:t>
+      </w:r>
+    </w:p>
+    <w:p>
+      <w:pPr>
+        <w:pStyle w:val="ListParagraph"/>
+        <w:numPr>
+          <w:ilvl w:val="0"/>
+          <w:numId w:val="1"/>
+        </w:numPr>
+      </w:pPr>
+      <w:r>
+        <w:t>Pools of pointers attached to each object in the pool</w:t>
+      </w:r>
+      <w:r>
+        <w:t>s</w:t>
+      </w:r>
+      <w:r>
+        <w:t xml:space="preserve"> used for polymorphic update</w:t>
+      </w:r>
+      <w:r>
+        <w:t>, render and collision checks.</w:t>
+      </w:r>
     </w:p>
     <w:tbl>
       <w:tblPr>
@@ -461,6 +566,7 @@
                 <w:sz w:val="24"/>
                 <w:szCs w:val="24"/>
               </w:rPr>
+              <w:lastRenderedPageBreak/>
               <w:t>Int totalNumberOfObjects</w:t>
             </w:r>
           </w:p>
@@ -498,59 +604,57 @@
                 <w:sz w:val="24"/>
                 <w:szCs w:val="24"/>
               </w:rPr>
-              <w:t>* arrayOfObjects[]</w:t>
-            </w:r>
-          </w:p>
-          <w:p>
-            <w:pPr>
+              <w:t>* arrayOfObjects</w:t>
+            </w:r>
+            <w:r>
               <w:rPr>
                 <w:sz w:val="24"/>
                 <w:szCs w:val="24"/>
               </w:rPr>
-            </w:pPr>
+              <w:t xml:space="preserve"> </w:t>
+            </w:r>
             <w:r>
               <w:rPr>
                 <w:sz w:val="24"/>
                 <w:szCs w:val="24"/>
               </w:rPr>
-              <w:t>Collideable</w:t>
-            </w:r>
-            <w:r>
+              <w:t>[]</w:t>
+            </w:r>
+          </w:p>
+          <w:p>
+            <w:pPr>
               <w:rPr>
                 <w:sz w:val="24"/>
                 <w:szCs w:val="24"/>
               </w:rPr>
-              <w:t>_Objects arrayOfCollideableObjects[]</w:t>
-            </w:r>
-          </w:p>
-          <w:p>
-            <w:pPr>
+            </w:pPr>
+            <w:r>
               <w:rPr>
                 <w:sz w:val="24"/>
                 <w:szCs w:val="24"/>
               </w:rPr>
-            </w:pPr>
+              <w:t>Collideable</w:t>
+            </w:r>
             <w:r>
               <w:rPr>
                 <w:sz w:val="24"/>
                 <w:szCs w:val="24"/>
               </w:rPr>
-              <w:t>Float backgroundScrollSpeedArray[]</w:t>
-            </w:r>
-          </w:p>
-          <w:p>
-            <w:pPr>
+              <w:t>_Objects arrayOfCollideableObjects</w:t>
+            </w:r>
+            <w:r>
               <w:rPr>
                 <w:sz w:val="24"/>
                 <w:szCs w:val="24"/>
               </w:rPr>
-            </w:pPr>
+              <w:t xml:space="preserve"> </w:t>
+            </w:r>
             <w:r>
               <w:rPr>
                 <w:sz w:val="24"/>
                 <w:szCs w:val="24"/>
               </w:rPr>
-              <w:t>Bullet bulletPool[]</w:t>
+              <w:t>[]</w:t>
             </w:r>
           </w:p>
           <w:p>
@@ -565,59 +669,144 @@
                 <w:sz w:val="24"/>
                 <w:szCs w:val="24"/>
               </w:rPr>
-              <w:t>Background backgroundPool[]</w:t>
-            </w:r>
-          </w:p>
-          <w:p>
-            <w:pPr>
+              <w:t>Float backgroundScrollSpeedArray</w:t>
+            </w:r>
+            <w:r>
               <w:rPr>
                 <w:sz w:val="24"/>
                 <w:szCs w:val="24"/>
               </w:rPr>
-            </w:pPr>
+              <w:t xml:space="preserve"> </w:t>
+            </w:r>
             <w:r>
               <w:rPr>
                 <w:sz w:val="24"/>
                 <w:szCs w:val="24"/>
               </w:rPr>
-              <w:t>Asteroid aster</w:t>
-            </w:r>
-            <w:r>
+              <w:t>[]</w:t>
+            </w:r>
+          </w:p>
+          <w:p>
+            <w:pPr>
               <w:rPr>
                 <w:sz w:val="24"/>
                 <w:szCs w:val="24"/>
               </w:rPr>
-              <w:t>oidPool[]</w:t>
-            </w:r>
-          </w:p>
-          <w:p>
-            <w:pPr>
+            </w:pPr>
+            <w:r>
               <w:rPr>
                 <w:sz w:val="24"/>
                 <w:szCs w:val="24"/>
               </w:rPr>
-            </w:pPr>
+              <w:t>Bullet bulletPool</w:t>
+            </w:r>
             <w:r>
               <w:rPr>
                 <w:sz w:val="24"/>
                 <w:szCs w:val="24"/>
               </w:rPr>
-              <w:t>Ship playerShip</w:t>
-            </w:r>
-          </w:p>
-          <w:p>
-            <w:pPr>
+              <w:t xml:space="preserve"> </w:t>
+            </w:r>
+            <w:r>
               <w:rPr>
                 <w:sz w:val="24"/>
                 <w:szCs w:val="24"/>
               </w:rPr>
-            </w:pPr>
-            <w:r>
+              <w:t>[]</w:t>
+            </w:r>
+          </w:p>
+          <w:p>
+            <w:pPr>
               <w:rPr>
                 <w:sz w:val="24"/>
                 <w:szCs w:val="24"/>
               </w:rPr>
-              <w:lastRenderedPageBreak/>
+            </w:pPr>
+            <w:r>
+              <w:rPr>
+                <w:sz w:val="24"/>
+                <w:szCs w:val="24"/>
+              </w:rPr>
+              <w:t>Background backgroundPool</w:t>
+            </w:r>
+            <w:r>
+              <w:rPr>
+                <w:sz w:val="24"/>
+                <w:szCs w:val="24"/>
+              </w:rPr>
+              <w:t xml:space="preserve"> </w:t>
+            </w:r>
+            <w:r>
+              <w:rPr>
+                <w:sz w:val="24"/>
+                <w:szCs w:val="24"/>
+              </w:rPr>
+              <w:t>[]</w:t>
+            </w:r>
+          </w:p>
+          <w:p>
+            <w:pPr>
+              <w:rPr>
+                <w:sz w:val="24"/>
+                <w:szCs w:val="24"/>
+              </w:rPr>
+            </w:pPr>
+            <w:r>
+              <w:rPr>
+                <w:sz w:val="24"/>
+                <w:szCs w:val="24"/>
+              </w:rPr>
+              <w:t>Asteroid aster</w:t>
+            </w:r>
+            <w:r>
+              <w:rPr>
+                <w:sz w:val="24"/>
+                <w:szCs w:val="24"/>
+              </w:rPr>
+              <w:t>oidPool</w:t>
+            </w:r>
+            <w:r>
+              <w:rPr>
+                <w:sz w:val="24"/>
+                <w:szCs w:val="24"/>
+              </w:rPr>
+              <w:t xml:space="preserve"> </w:t>
+            </w:r>
+            <w:r>
+              <w:rPr>
+                <w:sz w:val="24"/>
+                <w:szCs w:val="24"/>
+              </w:rPr>
+              <w:t>[]</w:t>
+            </w:r>
+          </w:p>
+          <w:p>
+            <w:pPr>
+              <w:rPr>
+                <w:sz w:val="24"/>
+                <w:szCs w:val="24"/>
+              </w:rPr>
+            </w:pPr>
+            <w:r>
+              <w:rPr>
+                <w:sz w:val="24"/>
+                <w:szCs w:val="24"/>
+              </w:rPr>
+              <w:t>Ship playerShip</w:t>
+            </w:r>
+          </w:p>
+          <w:p>
+            <w:pPr>
+              <w:rPr>
+                <w:sz w:val="24"/>
+                <w:szCs w:val="24"/>
+              </w:rPr>
+            </w:pPr>
+            <w:r>
+              <w:rPr>
+                <w:sz w:val="24"/>
+                <w:szCs w:val="24"/>
+              </w:rPr>
               <w:t>RenderWindow window</w:t>
             </w:r>
           </w:p>
@@ -1128,6 +1317,7 @@
           </w:p>
           <w:p>
             <w:r>
+              <w:lastRenderedPageBreak/>
               <w:t>Void pollEvents</w:t>
             </w:r>
           </w:p>
@@ -1184,7 +1374,6 @@
           </w:p>
           <w:p>
             <w:r>
-              <w:lastRenderedPageBreak/>
               <w:t xml:space="preserve">Void spawnAsteroids </w:t>
             </w:r>
           </w:p>
@@ -1215,7 +1404,63 @@
           <w:sz w:val="24"/>
           <w:szCs w:val="24"/>
         </w:rPr>
-        <w:t>The game object class is a virtual inheritance class inherited by the objects of the game providing a polymorphic way to update, render and initialize the objects in the game.</w:t>
+        <w:t xml:space="preserve">The game object class is a virtual inheritance class inherited by </w:t>
+      </w:r>
+      <w:r>
+        <w:rPr>
+          <w:sz w:val="24"/>
+          <w:szCs w:val="24"/>
+        </w:rPr>
+        <w:t xml:space="preserve">all </w:t>
+      </w:r>
+      <w:r>
+        <w:rPr>
+          <w:sz w:val="24"/>
+          <w:szCs w:val="24"/>
+        </w:rPr>
+        <w:t>the objects of the game</w:t>
+      </w:r>
+      <w:r>
+        <w:rPr>
+          <w:sz w:val="24"/>
+          <w:szCs w:val="24"/>
+        </w:rPr>
+        <w:t xml:space="preserve"> that require rendering and updating. It</w:t>
+      </w:r>
+      <w:r>
+        <w:rPr>
+          <w:sz w:val="24"/>
+          <w:szCs w:val="24"/>
+        </w:rPr>
+        <w:t xml:space="preserve"> provi</w:t>
+      </w:r>
+      <w:r>
+        <w:rPr>
+          <w:sz w:val="24"/>
+          <w:szCs w:val="24"/>
+        </w:rPr>
+        <w:t>des</w:t>
+      </w:r>
+      <w:r>
+        <w:rPr>
+          <w:sz w:val="24"/>
+          <w:szCs w:val="24"/>
+        </w:rPr>
+        <w:t xml:space="preserve"> a polymorphic way to update, render and initialize the objects </w:t>
+      </w:r>
+      <w:r>
+        <w:rPr>
+          <w:sz w:val="24"/>
+          <w:szCs w:val="24"/>
+        </w:rPr>
+        <w:t>that inherit from this class</w:t>
+      </w:r>
+      <w:r>
+        <w:rPr>
+          <w:sz w:val="24"/>
+          <w:szCs w:val="24"/>
+        </w:rPr>
+        <w:t>.</w:t>
       </w:r>
     </w:p>
     <w:p/>
@@ -1340,7 +1585,13 @@
     <w:p/>
     <w:p>
       <w:r>
-        <w:t>The collideable object class is a virtual class that is inherited by only the collideable o</w:t>
+        <w:t>The collideable object class is a virtual</w:t>
+      </w:r>
+      <w:r>
+        <w:t xml:space="preserve"> parent</w:t>
+      </w:r>
+      <w:r>
+        <w:t xml:space="preserve"> class that is inherited by only the collideable o</w:t>
       </w:r>
       <w:r>
         <w:t xml:space="preserve">bjects in the </w:t>
@@ -1352,7 +1603,64 @@
         <w:t xml:space="preserve"> for example bullets and asteroids. The class </w:t>
       </w:r>
       <w:r>
-        <w:t>contains a</w:t>
+        <w:t>contains</w:t>
+      </w:r>
+      <w:r>
+        <w:t xml:space="preserve"> a circle shape that acts as the </w:t>
+      </w:r>
+      <w:r>
+        <w:t>hitbox for the object that inherits it</w:t>
+      </w:r>
+      <w:r>
+        <w:t xml:space="preserve"> and</w:t>
+      </w:r>
+      <w:r>
+        <w:t xml:space="preserve"> during update loop </w:t>
+      </w:r>
+      <w:r>
+        <w:t>is</w:t>
+      </w:r>
+      <w:r>
+        <w:t xml:space="preserve"> </w:t>
+      </w:r>
+      <w:r>
+        <w:t>set</w:t>
+      </w:r>
+      <w:r>
+        <w:t xml:space="preserve"> to the position of the sprite</w:t>
+      </w:r>
+      <w:r>
+        <w:t>,</w:t>
+      </w:r>
+      <w:r>
+        <w:t xml:space="preserve"> this circle’s radius</w:t>
+      </w:r>
+      <w:r>
+        <w:t xml:space="preserve"> is scaled to fit the sprite</w:t>
+      </w:r>
+      <w:r>
+        <w:t>. C</w:t>
+      </w:r>
+      <w:r>
+        <w:t xml:space="preserve">ollision is calculated by doing radius of both objects added together </w:t>
+      </w:r>
+      <w:r>
+        <w:t xml:space="preserve">squared </w:t>
+      </w:r>
+      <w:r>
+        <w:t xml:space="preserve">checked against the distance between the objects squared if the distance is smaller than the </w:t>
+      </w:r>
+      <w:r>
+        <w:t>radius squared then you have collision</w:t>
+      </w:r>
+      <w:r>
+        <w:t>.</w:t>
+      </w:r>
+      <w:r>
+        <w:t xml:space="preserve"> </w:t>
+      </w:r>
+      <w:r>
+        <w:t>A</w:t>
       </w:r>
       <w:r>
         <w:t xml:space="preserve">n </w:t>
@@ -1368,22 +1676,34 @@
       </w:r>
       <w:r>
         <w:t>collision.</w:t>
+      </w:r>
+      <w:r>
+        <w:t xml:space="preserve"> </w:t>
+      </w:r>
+      <w:r>
+        <w:t>This</w:t>
+      </w:r>
+      <w:r>
+        <w:t xml:space="preserve"> allows for one polymorphic function call to check collision against all the objects in the game</w:t>
+      </w:r>
+      <w:r>
+        <w:t>.</w:t>
       </w:r>
     </w:p>
     <w:tbl>
       <w:tblPr>
         <w:tblStyle w:val="TableGrid"/>
         <w:tblW w:w="0" w:type="auto"/>
-        <w:tblInd w:w="360" w:type="dxa"/>
+        <w:tblInd w:w="-5" w:type="dxa"/>
         <w:tblLook w:val="04A0" w:firstRow="1" w:lastRow="0" w:firstColumn="1" w:lastColumn="0" w:noHBand="0" w:noVBand="1"/>
       </w:tblPr>
       <w:tblGrid>
-        <w:gridCol w:w="8140"/>
+        <w:gridCol w:w="8505"/>
       </w:tblGrid>
       <w:tr>
         <w:tc>
           <w:tcPr>
-            <w:tcW w:w="8140" w:type="dxa"/>
+            <w:tcW w:w="8505" w:type="dxa"/>
           </w:tcPr>
           <w:p>
             <w:pPr>
@@ -1413,7 +1733,7 @@
       <w:tr>
         <w:tc>
           <w:tcPr>
-            <w:tcW w:w="8140" w:type="dxa"/>
+            <w:tcW w:w="8505" w:type="dxa"/>
           </w:tcPr>
           <w:p>
             <w:r>
@@ -1443,6 +1763,7 @@
           </w:p>
           <w:p>
             <w:r>
+              <w:lastRenderedPageBreak/>
               <w:t xml:space="preserve">      SMALL_ASTEROID</w:t>
             </w:r>
             <w:r>
@@ -1474,22 +1795,10 @@
           </w:p>
           <w:p>
             <w:r>
-              <w:t>Void getIsCollideable</w:t>
-            </w:r>
-          </w:p>
-          <w:p>
-            <w:r>
-              <w:t>Void setCollideable</w:t>
-            </w:r>
-          </w:p>
-          <w:p>
-            <w:r>
-              <w:t>Void deactivateCollision</w:t>
-            </w:r>
-          </w:p>
-          <w:p>
-            <w:r>
-              <w:t>typeOfObject getType</w:t>
+              <w:t xml:space="preserve">CircleShape </w:t>
+            </w:r>
+            <w:r>
+              <w:t>circularHitbox</w:t>
             </w:r>
           </w:p>
           <w:p/>
@@ -1498,43 +1807,79 @@
       <w:tr>
         <w:tc>
           <w:tcPr>
-            <w:tcW w:w="8140" w:type="dxa"/>
+            <w:tcW w:w="8505" w:type="dxa"/>
           </w:tcPr>
           <w:p>
             <w:r>
-              <w:rPr>
-                <w:color w:val="0070C0"/>
-              </w:rPr>
-              <w:t xml:space="preserve">Virtual </w:t>
+              <w:lastRenderedPageBreak/>
+              <w:t>float</w:t>
             </w:r>
             <w:r>
               <w:rPr>
                 <w:color w:val="000000" w:themeColor="text1"/>
               </w:rPr>
-              <w:t>F</w:t>
-            </w:r>
-            <w:r>
-              <w:rPr>
-                <w:color w:val="000000" w:themeColor="text1"/>
-              </w:rPr>
-              <w:t xml:space="preserve">loatRect </w:t>
-            </w:r>
-            <w:r>
-              <w:t>getBounds</w:t>
-            </w:r>
-          </w:p>
-          <w:p>
-            <w:r>
-              <w:rPr>
-                <w:color w:val="0070C0"/>
-              </w:rPr>
-              <w:t xml:space="preserve">Virtual </w:t>
-            </w:r>
+              <w:t xml:space="preserve"> </w:t>
+            </w:r>
+            <w:r>
+              <w:t>get</w:t>
+            </w:r>
+            <w:r>
+              <w:t>Radius</w:t>
+            </w:r>
+          </w:p>
+          <w:p>
+            <w:r>
+              <w:t>Void getIsCollideable</w:t>
+            </w:r>
+          </w:p>
+          <w:p>
+            <w:r>
+              <w:t>Void setCollideable</w:t>
+            </w:r>
+          </w:p>
+          <w:p>
+            <w:r>
+              <w:t>Void deactivateCollision</w:t>
+            </w:r>
+          </w:p>
+          <w:p>
+            <w:r>
+              <w:t>typeOfObject getType</w:t>
+            </w:r>
+          </w:p>
+          <w:p/>
+          <w:p>
+            <w:r>
+              <w:t>Vector2f getHitboxPosition</w:t>
+            </w:r>
+          </w:p>
+          <w:p>
             <w:r>
               <w:t>Bool collisionCheck</w:t>
             </w:r>
             <w:r>
-              <w:t xml:space="preserve"> (FloatRect objectYouAreHitting)</w:t>
+              <w:t xml:space="preserve"> (</w:t>
+            </w:r>
+            <w:r>
+              <w:t>float radius</w:t>
+            </w:r>
+            <w:r>
+              <w:t>Squared</w:t>
+            </w:r>
+            <w:r>
+              <w:t xml:space="preserve">, </w:t>
+            </w:r>
+            <w:r>
+              <w:t>float</w:t>
+            </w:r>
+            <w:r>
+              <w:t xml:space="preserve"> distance</w:t>
+            </w:r>
+            <w:r>
+              <w:t>Squared</w:t>
+            </w:r>
+            <w:r>
+              <w:t>)</w:t>
             </w:r>
           </w:p>
           <w:p>
@@ -1583,16 +1928,16 @@
       <w:tblPr>
         <w:tblStyle w:val="TableGrid"/>
         <w:tblW w:w="0" w:type="auto"/>
-        <w:tblInd w:w="360" w:type="dxa"/>
+        <w:tblInd w:w="-5" w:type="dxa"/>
         <w:tblLook w:val="04A0" w:firstRow="1" w:lastRow="0" w:firstColumn="1" w:lastColumn="0" w:noHBand="0" w:noVBand="1"/>
       </w:tblPr>
       <w:tblGrid>
-        <w:gridCol w:w="8656"/>
+        <w:gridCol w:w="9021"/>
       </w:tblGrid>
       <w:tr>
         <w:tc>
           <w:tcPr>
-            <w:tcW w:w="9016" w:type="dxa"/>
+            <w:tcW w:w="9021" w:type="dxa"/>
           </w:tcPr>
           <w:p>
             <w:pPr>
@@ -1606,7 +1951,6 @@
                 <w:sz w:val="28"/>
                 <w:szCs w:val="28"/>
               </w:rPr>
-              <w:lastRenderedPageBreak/>
               <w:t>Ship</w:t>
             </w:r>
             <w:r>
@@ -1637,7 +1981,7 @@
       <w:tr>
         <w:tc>
           <w:tcPr>
-            <w:tcW w:w="9016" w:type="dxa"/>
+            <w:tcW w:w="9021" w:type="dxa"/>
           </w:tcPr>
           <w:p>
             <w:r>
@@ -1765,7 +2109,7 @@
       <w:tr>
         <w:tc>
           <w:tcPr>
-            <w:tcW w:w="9016" w:type="dxa"/>
+            <w:tcW w:w="9021" w:type="dxa"/>
           </w:tcPr>
           <w:p>
             <w:r>
@@ -1805,53 +2149,16 @@
           <w:p/>
           <w:p>
             <w:r>
-              <w:rPr>
-                <w:color w:val="000000" w:themeColor="text1"/>
-              </w:rPr>
-              <w:t xml:space="preserve">FloatRect </w:t>
-            </w:r>
-            <w:r>
-              <w:t>getBounds</w:t>
+              <w:t>Void</w:t>
+            </w:r>
+            <w:r>
+              <w:t xml:space="preserve"> collisionOutcome</w:t>
             </w:r>
             <w:r>
               <w:t xml:space="preserve"> </w:t>
             </w:r>
             <w:r>
-              <w:rPr>
-                <w:color w:val="C00000"/>
-              </w:rPr>
-              <w:t>override</w:t>
-            </w:r>
-          </w:p>
-          <w:p>
-            <w:r>
-              <w:t>Bool collisionCheck (FloatRect objectYouAreHitting)</w:t>
-            </w:r>
-            <w:r>
-              <w:t xml:space="preserve"> </w:t>
-            </w:r>
-            <w:r>
-              <w:rPr>
-                <w:color w:val="C00000"/>
-              </w:rPr>
-              <w:t>override</w:t>
-            </w:r>
-          </w:p>
-          <w:p>
-            <w:r>
-              <w:t>Void</w:t>
-            </w:r>
-            <w:r>
-              <w:t xml:space="preserve"> collisionOutcome</w:t>
-            </w:r>
-            <w:r>
-              <w:t xml:space="preserve"> </w:t>
-            </w:r>
-            <w:r>
-              <w:t>(bool collisionFlag, typeOfObject objectType)</w:t>
-            </w:r>
-            <w:r>
-              <w:t xml:space="preserve"> </w:t>
+              <w:t xml:space="preserve">(bool collisionFlag, typeOfObject objectType) </w:t>
             </w:r>
             <w:r>
               <w:rPr>
@@ -1906,16 +2213,16 @@
       <w:tblPr>
         <w:tblStyle w:val="TableGrid"/>
         <w:tblW w:w="0" w:type="auto"/>
-        <w:tblInd w:w="360" w:type="dxa"/>
+        <w:tblInd w:w="-5" w:type="dxa"/>
         <w:tblLook w:val="04A0" w:firstRow="1" w:lastRow="0" w:firstColumn="1" w:lastColumn="0" w:noHBand="0" w:noVBand="1"/>
       </w:tblPr>
       <w:tblGrid>
-        <w:gridCol w:w="8656"/>
+        <w:gridCol w:w="9021"/>
       </w:tblGrid>
       <w:tr>
         <w:tc>
           <w:tcPr>
-            <w:tcW w:w="9016" w:type="dxa"/>
+            <w:tcW w:w="9021" w:type="dxa"/>
           </w:tcPr>
           <w:p>
             <w:pPr>
@@ -1952,7 +2259,7 @@
       <w:tr>
         <w:tc>
           <w:tcPr>
-            <w:tcW w:w="9016" w:type="dxa"/>
+            <w:tcW w:w="9021" w:type="dxa"/>
           </w:tcPr>
           <w:p>
             <w:r>
@@ -1989,16 +2296,95 @@
           </w:p>
           <w:p>
             <w:r>
-              <w:t>Float bull</w:t>
-            </w:r>
-          </w:p>
+              <w:t>intRect</w:t>
+            </w:r>
+            <w:r>
+              <w:t xml:space="preserve"> bulletRect</w:t>
+            </w:r>
+          </w:p>
+          <w:p>
+            <w:r>
+              <w:t xml:space="preserve">vector2f bulletPosition </w:t>
+            </w:r>
+          </w:p>
+          <w:p>
+            <w:r>
+              <w:t xml:space="preserve">int spriteSize </w:t>
+            </w:r>
+          </w:p>
+          <w:p/>
         </w:tc>
       </w:tr>
       <w:tr>
         <w:tc>
           <w:tcPr>
-            <w:tcW w:w="9016" w:type="dxa"/>
+            <w:tcW w:w="9021" w:type="dxa"/>
           </w:tcPr>
+          <w:p>
+            <w:r>
+              <w:t>Void setTexture</w:t>
+            </w:r>
+          </w:p>
+          <w:p>
+            <w:r>
+              <w:t>Void fireBullet</w:t>
+            </w:r>
+          </w:p>
+          <w:p>
+            <w:r>
+              <w:t>Void turnOffBullet</w:t>
+            </w:r>
+          </w:p>
+          <w:p>
+            <w:r>
+              <w:t>Void scaleAndCentre</w:t>
+            </w:r>
+          </w:p>
+          <w:p/>
+          <w:p>
+            <w:r>
+              <w:t xml:space="preserve">Void collisionOutcome (bool collisionFlag, typeOfObject objectType) </w:t>
+            </w:r>
+            <w:r>
+              <w:rPr>
+                <w:color w:val="C00000"/>
+              </w:rPr>
+              <w:t>override</w:t>
+            </w:r>
+          </w:p>
+          <w:p>
+            <w:r>
+              <w:t xml:space="preserve">void updateObject) </w:t>
+            </w:r>
+            <w:r>
+              <w:rPr>
+                <w:color w:val="C00000"/>
+              </w:rPr>
+              <w:t>override</w:t>
+            </w:r>
+          </w:p>
+          <w:p>
+            <w:r>
+              <w:t xml:space="preserve">void renderObject) </w:t>
+            </w:r>
+            <w:r>
+              <w:rPr>
+                <w:color w:val="C00000"/>
+              </w:rPr>
+              <w:t>override</w:t>
+            </w:r>
+          </w:p>
+          <w:p>
+            <w:r>
+              <w:t xml:space="preserve">void initializeObject) </w:t>
+            </w:r>
+            <w:r>
+              <w:rPr>
+                <w:color w:val="C00000"/>
+              </w:rPr>
+              <w:t>override</w:t>
+            </w:r>
+          </w:p>
           <w:p/>
         </w:tc>
       </w:tr>
@@ -2008,6 +2394,680 @@
         <w:ind w:left="360"/>
       </w:pPr>
     </w:p>
+    <w:tbl>
+      <w:tblPr>
+        <w:tblStyle w:val="TableGrid"/>
+        <w:tblW w:w="0" w:type="auto"/>
+        <w:tblLook w:val="04A0" w:firstRow="1" w:lastRow="0" w:firstColumn="1" w:lastColumn="0" w:noHBand="0" w:noVBand="1"/>
+      </w:tblPr>
+      <w:tblGrid>
+        <w:gridCol w:w="9016"/>
+      </w:tblGrid>
+      <w:tr>
+        <w:tc>
+          <w:tcPr>
+            <w:tcW w:w="9016" w:type="dxa"/>
+          </w:tcPr>
+          <w:p>
+            <w:pPr>
+              <w:rPr>
+                <w:sz w:val="28"/>
+                <w:szCs w:val="28"/>
+              </w:rPr>
+            </w:pPr>
+            <w:r>
+              <w:rPr>
+                <w:sz w:val="28"/>
+                <w:szCs w:val="28"/>
+              </w:rPr>
+              <w:t>Asteroid: Collideable_Object, Game_Object</w:t>
+            </w:r>
+          </w:p>
+          <w:p/>
+        </w:tc>
+      </w:tr>
+      <w:tr>
+        <w:tc>
+          <w:tcPr>
+            <w:tcW w:w="9016" w:type="dxa"/>
+          </w:tcPr>
+          <w:p>
+            <w:r>
+              <w:t>Sprite asteroidSprite</w:t>
+            </w:r>
+          </w:p>
+          <w:p>
+            <w:r>
+              <w:t>Float normalSpeed</w:t>
+            </w:r>
+          </w:p>
+          <w:p>
+            <w:r>
+              <w:t>Float smallSpeed</w:t>
+            </w:r>
+          </w:p>
+          <w:p>
+            <w:r>
+              <w:t xml:space="preserve">Float </w:t>
+            </w:r>
+            <w:r>
+              <w:t>largeSpeed</w:t>
+            </w:r>
+          </w:p>
+          <w:p>
+            <w:r>
+              <w:t xml:space="preserve">Vector2f </w:t>
+            </w:r>
+            <w:r>
+              <w:t>asteroidMoveVector</w:t>
+            </w:r>
+          </w:p>
+          <w:p>
+            <w:r>
+              <w:t>I</w:t>
+            </w:r>
+            <w:r>
+              <w:t>nt</w:t>
+            </w:r>
+            <w:r>
+              <w:t xml:space="preserve"> spriteSize</w:t>
+            </w:r>
+          </w:p>
+          <w:p>
+            <w:r>
+              <w:t>I</w:t>
+            </w:r>
+            <w:r>
+              <w:t>ntRect asteroidRect</w:t>
+            </w:r>
+          </w:p>
+          <w:p>
+            <w:r>
+              <w:t xml:space="preserve">int </w:t>
+            </w:r>
+            <w:r>
+              <w:t>largeHealth, smallHealth, normalHealth</w:t>
+            </w:r>
+          </w:p>
+          <w:p>
+            <w:r>
+              <w:t>int scoreTracker</w:t>
+            </w:r>
+          </w:p>
+          <w:p>
+            <w:r>
+              <w:t>float smallScaler</w:t>
+            </w:r>
+          </w:p>
+          <w:p>
+            <w:r>
+              <w:t>float largeScaler</w:t>
+            </w:r>
+          </w:p>
+          <w:p>
+            <w:r>
+              <w:t>float animationSpeed</w:t>
+            </w:r>
+          </w:p>
+          <w:p/>
+        </w:tc>
+      </w:tr>
+      <w:tr>
+        <w:tc>
+          <w:tcPr>
+            <w:tcW w:w="9016" w:type="dxa"/>
+          </w:tcPr>
+          <w:p>
+            <w:r>
+              <w:t>Void resetAsteroid</w:t>
+            </w:r>
+          </w:p>
+          <w:p>
+            <w:r>
+              <w:t>Void setTexture</w:t>
+            </w:r>
+          </w:p>
+          <w:p>
+            <w:r>
+              <w:t>Void spawnAsteroid</w:t>
+            </w:r>
+          </w:p>
+          <w:p>
+            <w:r>
+              <w:lastRenderedPageBreak/>
+              <w:t>Int getScore</w:t>
+            </w:r>
+          </w:p>
+          <w:p>
+            <w:r>
+              <w:t>Void animateAsteroid</w:t>
+            </w:r>
+          </w:p>
+          <w:p>
+            <w:r>
+              <w:t>Void turnOffAset</w:t>
+            </w:r>
+            <w:r>
+              <w:t>eroid</w:t>
+            </w:r>
+          </w:p>
+          <w:p>
+            <w:r>
+              <w:t>Void turnOnAsteroid</w:t>
+            </w:r>
+          </w:p>
+          <w:p>
+            <w:r>
+              <w:t>Void killAsteroid</w:t>
+            </w:r>
+          </w:p>
+          <w:p/>
+          <w:p>
+            <w:r>
+              <w:t xml:space="preserve">Void collisionOutcome (bool collisionFlag, typeOfObject objectType) </w:t>
+            </w:r>
+            <w:r>
+              <w:rPr>
+                <w:color w:val="C00000"/>
+              </w:rPr>
+              <w:t>override</w:t>
+            </w:r>
+          </w:p>
+          <w:p>
+            <w:r>
+              <w:t xml:space="preserve">void updateObject) </w:t>
+            </w:r>
+            <w:r>
+              <w:rPr>
+                <w:color w:val="C00000"/>
+              </w:rPr>
+              <w:t>override</w:t>
+            </w:r>
+          </w:p>
+          <w:p>
+            <w:r>
+              <w:t xml:space="preserve">void renderObject) </w:t>
+            </w:r>
+            <w:r>
+              <w:rPr>
+                <w:color w:val="C00000"/>
+              </w:rPr>
+              <w:t>override</w:t>
+            </w:r>
+          </w:p>
+          <w:p>
+            <w:r>
+              <w:t xml:space="preserve">void initializeObject) </w:t>
+            </w:r>
+            <w:r>
+              <w:rPr>
+                <w:color w:val="C00000"/>
+              </w:rPr>
+              <w:t>override</w:t>
+            </w:r>
+          </w:p>
+          <w:p/>
+          <w:p/>
+        </w:tc>
+      </w:tr>
+    </w:tbl>
+    <w:p/>
+    <w:tbl>
+      <w:tblPr>
+        <w:tblStyle w:val="TableGrid"/>
+        <w:tblW w:w="0" w:type="auto"/>
+        <w:tblLook w:val="04A0" w:firstRow="1" w:lastRow="0" w:firstColumn="1" w:lastColumn="0" w:noHBand="0" w:noVBand="1"/>
+      </w:tblPr>
+      <w:tblGrid>
+        <w:gridCol w:w="9016"/>
+      </w:tblGrid>
+      <w:tr>
+        <w:tc>
+          <w:tcPr>
+            <w:tcW w:w="9016" w:type="dxa"/>
+          </w:tcPr>
+          <w:p>
+            <w:pPr>
+              <w:rPr>
+                <w:sz w:val="28"/>
+                <w:szCs w:val="28"/>
+              </w:rPr>
+            </w:pPr>
+            <w:r>
+              <w:rPr>
+                <w:sz w:val="28"/>
+                <w:szCs w:val="28"/>
+              </w:rPr>
+              <w:t>Background:</w:t>
+            </w:r>
+            <w:r>
+              <w:rPr>
+                <w:sz w:val="28"/>
+                <w:szCs w:val="28"/>
+              </w:rPr>
+              <w:t xml:space="preserve"> Game_Object</w:t>
+            </w:r>
+          </w:p>
+          <w:p>
+            <w:pPr>
+              <w:rPr>
+                <w:sz w:val="28"/>
+                <w:szCs w:val="28"/>
+              </w:rPr>
+            </w:pPr>
+          </w:p>
+        </w:tc>
+      </w:tr>
+      <w:tr>
+        <w:tc>
+          <w:tcPr>
+            <w:tcW w:w="9016" w:type="dxa"/>
+          </w:tcPr>
+          <w:p>
+            <w:r>
+              <w:t>Sprite backgroundSprite</w:t>
+            </w:r>
+          </w:p>
+          <w:p>
+            <w:r>
+              <w:t>intRect backgrondRect</w:t>
+            </w:r>
+          </w:p>
+          <w:p>
+            <w:r>
+              <w:t>float sprite</w:t>
+            </w:r>
+            <w:r>
+              <w:t>Speed</w:t>
+            </w:r>
+          </w:p>
+          <w:p>
+            <w:r>
+              <w:t>float scrollOffSet</w:t>
+            </w:r>
+          </w:p>
+          <w:p/>
+        </w:tc>
+      </w:tr>
+      <w:tr>
+        <w:tc>
+          <w:tcPr>
+            <w:tcW w:w="9016" w:type="dxa"/>
+          </w:tcPr>
+          <w:p>
+            <w:r>
+              <w:t>Void setTexture</w:t>
+            </w:r>
+            <w:r>
+              <w:t>AndSpeed</w:t>
+            </w:r>
+          </w:p>
+          <w:p>
+            <w:r>
+              <w:t>Void centerAndScaleSprite</w:t>
+            </w:r>
+          </w:p>
+          <w:p/>
+          <w:p>
+            <w:r>
+              <w:rPr>
+                <w:color w:val="000000" w:themeColor="text1"/>
+              </w:rPr>
+              <w:t xml:space="preserve">FloatRect </w:t>
+            </w:r>
+            <w:r>
+              <w:t xml:space="preserve">getBounds </w:t>
+            </w:r>
+            <w:r>
+              <w:rPr>
+                <w:color w:val="C00000"/>
+              </w:rPr>
+              <w:t>override</w:t>
+            </w:r>
+          </w:p>
+          <w:p>
+            <w:r>
+              <w:t xml:space="preserve">Bool collisionCheck (FloatRect objectYouAreHitting) </w:t>
+            </w:r>
+            <w:r>
+              <w:rPr>
+                <w:color w:val="C00000"/>
+              </w:rPr>
+              <w:t>override</w:t>
+            </w:r>
+          </w:p>
+          <w:p>
+            <w:r>
+              <w:t xml:space="preserve">Void collisionOutcome (bool collisionFlag, typeOfObject objectType) </w:t>
+            </w:r>
+            <w:r>
+              <w:rPr>
+                <w:color w:val="C00000"/>
+              </w:rPr>
+              <w:t>override</w:t>
+            </w:r>
+          </w:p>
+          <w:p>
+            <w:r>
+              <w:t xml:space="preserve">void updateObject) </w:t>
+            </w:r>
+            <w:r>
+              <w:rPr>
+                <w:color w:val="C00000"/>
+              </w:rPr>
+              <w:t>override</w:t>
+            </w:r>
+          </w:p>
+          <w:p>
+            <w:r>
+              <w:t xml:space="preserve">void renderObject) </w:t>
+            </w:r>
+            <w:r>
+              <w:rPr>
+                <w:color w:val="C00000"/>
+              </w:rPr>
+              <w:t>override</w:t>
+            </w:r>
+          </w:p>
+          <w:p>
+            <w:r>
+              <w:t xml:space="preserve">void initializeObject) </w:t>
+            </w:r>
+            <w:r>
+              <w:rPr>
+                <w:color w:val="C00000"/>
+              </w:rPr>
+              <w:t>override</w:t>
+            </w:r>
+          </w:p>
+          <w:p/>
+        </w:tc>
+      </w:tr>
+    </w:tbl>
+    <w:p/>
+    <w:p>
+      <w:r>
+        <w:t xml:space="preserve">The input manager class takes in various player inputs and outputs </w:t>
+      </w:r>
+      <w:r>
+        <w:t>Boolean</w:t>
+      </w:r>
+      <w:r>
+        <w:t xml:space="preserve"> flags that can be used to update the direction of the </w:t>
+      </w:r>
+      <w:r>
+        <w:t>player-controlled</w:t>
+      </w:r>
+      <w:r>
+        <w:t xml:space="preserve"> ship or tell the </w:t>
+      </w:r>
+      <w:r>
+        <w:t>game manager class if the player wants to fire or not. By placing it into its own class it allows for further expansion into other control schemes like controller and joystick easier.</w:t>
+      </w:r>
+    </w:p>
+    <w:tbl>
+      <w:tblPr>
+        <w:tblStyle w:val="TableGrid"/>
+        <w:tblW w:w="0" w:type="auto"/>
+        <w:tblLook w:val="04A0" w:firstRow="1" w:lastRow="0" w:firstColumn="1" w:lastColumn="0" w:noHBand="0" w:noVBand="1"/>
+      </w:tblPr>
+      <w:tblGrid>
+        <w:gridCol w:w="9016"/>
+      </w:tblGrid>
+      <w:tr>
+        <w:tc>
+          <w:tcPr>
+            <w:tcW w:w="9016" w:type="dxa"/>
+          </w:tcPr>
+          <w:p>
+            <w:pPr>
+              <w:rPr>
+                <w:sz w:val="28"/>
+                <w:szCs w:val="28"/>
+              </w:rPr>
+            </w:pPr>
+            <w:r>
+              <w:rPr>
+                <w:sz w:val="28"/>
+                <w:szCs w:val="28"/>
+              </w:rPr>
+              <w:t xml:space="preserve">Input </w:t>
+            </w:r>
+            <w:r>
+              <w:rPr>
+                <w:sz w:val="28"/>
+                <w:szCs w:val="28"/>
+              </w:rPr>
+              <w:t>manager</w:t>
+            </w:r>
+          </w:p>
+          <w:p>
+            <w:pPr>
+              <w:rPr>
+                <w:sz w:val="28"/>
+                <w:szCs w:val="28"/>
+              </w:rPr>
+            </w:pPr>
+          </w:p>
+        </w:tc>
+      </w:tr>
+      <w:tr>
+        <w:tc>
+          <w:tcPr>
+            <w:tcW w:w="9016" w:type="dxa"/>
+          </w:tcPr>
+          <w:p>
+            <w:r>
+              <w:t>Bool inputUp</w:t>
+            </w:r>
+          </w:p>
+          <w:p>
+            <w:r>
+              <w:t>Bool inputDown</w:t>
+            </w:r>
+          </w:p>
+          <w:p>
+            <w:r>
+              <w:t>Bool inputLeft</w:t>
+            </w:r>
+          </w:p>
+          <w:p>
+            <w:r>
+              <w:t>Bool inputRight</w:t>
+            </w:r>
+          </w:p>
+          <w:p>
+            <w:r>
+              <w:t>Bool inputFire</w:t>
+            </w:r>
+          </w:p>
+          <w:p>
+            <w:r>
+              <w:t>Float fireRate</w:t>
+            </w:r>
+          </w:p>
+          <w:p>
+            <w:r>
+              <w:t>Float fireRateTracker</w:t>
+            </w:r>
+          </w:p>
+          <w:p/>
+          <w:p/>
+        </w:tc>
+      </w:tr>
+      <w:tr>
+        <w:tc>
+          <w:tcPr>
+            <w:tcW w:w="9016" w:type="dxa"/>
+          </w:tcPr>
+          <w:p>
+            <w:r>
+              <w:t>Void updateInput</w:t>
+            </w:r>
+          </w:p>
+          <w:p>
+            <w:r>
+              <w:lastRenderedPageBreak/>
+              <w:t>Void resetReadyToFireBool</w:t>
+            </w:r>
+          </w:p>
+          <w:p>
+            <w:r>
+              <w:t>Bool getUp</w:t>
+            </w:r>
+          </w:p>
+          <w:p>
+            <w:r>
+              <w:t>Bool getDown</w:t>
+            </w:r>
+          </w:p>
+          <w:p>
+            <w:r>
+              <w:t>Bool getLeft</w:t>
+            </w:r>
+          </w:p>
+          <w:p>
+            <w:r>
+              <w:t>Bool getRight</w:t>
+            </w:r>
+          </w:p>
+          <w:p>
+            <w:r>
+              <w:t>Bool getFire</w:t>
+            </w:r>
+          </w:p>
+        </w:tc>
+      </w:tr>
+    </w:tbl>
+    <w:p/>
+    <w:p>
+      <w:r>
+        <w:t xml:space="preserve">The collision manager </w:t>
+      </w:r>
+      <w:r>
+        <w:t xml:space="preserve">is a struct containing all the collision detection logic </w:t>
+      </w:r>
+      <w:r>
+        <w:t>and polymorphic</w:t>
+      </w:r>
+      <w:r>
+        <w:t xml:space="preserve"> </w:t>
+      </w:r>
+      <w:r>
+        <w:t>function call</w:t>
+      </w:r>
+      <w:r>
+        <w:t xml:space="preserve"> to calculate the outcomes of collision.</w:t>
+      </w:r>
+      <w:r>
+        <w:t xml:space="preserve"> </w:t>
+      </w:r>
+      <w:r>
+        <w:t>By</w:t>
+      </w:r>
+      <w:r>
+        <w:t xml:space="preserve"> placing it </w:t>
+      </w:r>
+      <w:r>
+        <w:t>in</w:t>
+      </w:r>
+      <w:r>
+        <w:t xml:space="preserve"> </w:t>
+      </w:r>
+      <w:r>
+        <w:t>its</w:t>
+      </w:r>
+      <w:r>
+        <w:t xml:space="preserve"> own </w:t>
+      </w:r>
+      <w:r>
+        <w:t>struct</w:t>
+      </w:r>
+      <w:r>
+        <w:t xml:space="preserve"> class</w:t>
+      </w:r>
+      <w:r>
+        <w:t xml:space="preserve"> it allows future updates or changes to the logic to be </w:t>
+      </w:r>
+      <w:r>
+        <w:t>made</w:t>
+      </w:r>
+      <w:r>
+        <w:t xml:space="preserve"> easily and </w:t>
+      </w:r>
+      <w:r>
+        <w:t>quickly.</w:t>
+      </w:r>
+    </w:p>
+    <w:tbl>
+      <w:tblPr>
+        <w:tblStyle w:val="TableGrid"/>
+        <w:tblW w:w="9782" w:type="dxa"/>
+        <w:tblInd w:w="-289" w:type="dxa"/>
+        <w:tblLook w:val="04A0" w:firstRow="1" w:lastRow="0" w:firstColumn="1" w:lastColumn="0" w:noHBand="0" w:noVBand="1"/>
+      </w:tblPr>
+      <w:tblGrid>
+        <w:gridCol w:w="9782"/>
+      </w:tblGrid>
+      <w:tr>
+        <w:tc>
+          <w:tcPr>
+            <w:tcW w:w="9782" w:type="dxa"/>
+          </w:tcPr>
+          <w:p>
+            <w:pPr>
+              <w:rPr>
+                <w:sz w:val="28"/>
+                <w:szCs w:val="28"/>
+              </w:rPr>
+            </w:pPr>
+            <w:r>
+              <w:rPr>
+                <w:sz w:val="28"/>
+                <w:szCs w:val="28"/>
+              </w:rPr>
+              <w:t xml:space="preserve">Collision manager </w:t>
+            </w:r>
+          </w:p>
+          <w:p>
+            <w:pPr>
+              <w:rPr>
+                <w:sz w:val="28"/>
+                <w:szCs w:val="28"/>
+              </w:rPr>
+            </w:pPr>
+          </w:p>
+        </w:tc>
+      </w:tr>
+      <w:tr>
+        <w:tc>
+          <w:tcPr>
+            <w:tcW w:w="9782" w:type="dxa"/>
+          </w:tcPr>
+          <w:p>
+            <w:r>
+              <w:t>Void updateCollision</w:t>
+            </w:r>
+            <w:r>
+              <w:t xml:space="preserve"> </w:t>
+            </w:r>
+            <w:r>
+              <w:t xml:space="preserve">( collideable_Object * </w:t>
+            </w:r>
+            <w:r>
+              <w:t>arrayOfCollideableObjectPtrs []</w:t>
+            </w:r>
+            <w:r>
+              <w:t>,</w:t>
+            </w:r>
+            <w:r>
+              <w:t xml:space="preserve"> int amountOfObjects)</w:t>
+            </w:r>
+          </w:p>
+        </w:tc>
+      </w:tr>
+    </w:tbl>
+    <w:p/>
     <w:p/>
     <w:p>
       <w:pPr>
@@ -2320,6 +3380,7 @@
           </w:tcPr>
           <w:p>
             <w:r>
+              <w:lastRenderedPageBreak/>
               <w:t xml:space="preserve">The ship collides with an asteroid </w:t>
             </w:r>
           </w:p>
@@ -2361,7 +3422,6 @@
           </w:tcPr>
           <w:p>
             <w:r>
-              <w:lastRenderedPageBreak/>
               <w:t>The sh</w:t>
             </w:r>
             <w:r>
@@ -2374,11 +3434,7 @@
           <w:p/>
           <w:p>
             <w:r>
-              <w:t xml:space="preserve">The asteroid is removed from the update and rendering loop and is no longer </w:t>
-            </w:r>
-            <w:r>
-              <w:lastRenderedPageBreak/>
-              <w:t xml:space="preserve">able to </w:t>
+              <w:t xml:space="preserve">The asteroid is removed from the update and rendering loop and is no longer able to </w:t>
             </w:r>
             <w:r>
               <w:t>collide</w:t>
@@ -2409,7 +3465,6 @@
           </w:tcPr>
           <w:p>
             <w:r>
-              <w:lastRenderedPageBreak/>
               <w:t>The player stat</w:t>
             </w:r>
             <w:r>
@@ -2431,11 +3486,7 @@
               <w:t>each time the update function was calle</w:t>
             </w:r>
             <w:r>
-              <w:t xml:space="preserve">d a new string would be </w:t>
-            </w:r>
-            <w:r>
-              <w:lastRenderedPageBreak/>
-              <w:t xml:space="preserve">added to the old string creating a long string and </w:t>
+              <w:t xml:space="preserve">d a new string would be added to the old string creating a long string and </w:t>
             </w:r>
             <w:r>
               <w:t>game breaking lag.</w:t>
@@ -2456,7 +3507,6 @@
           </w:tcPr>
           <w:p>
             <w:r>
-              <w:lastRenderedPageBreak/>
               <w:t>The ship reaches 0 health</w:t>
             </w:r>
           </w:p>
@@ -2631,7 +3681,11 @@
           </w:tcPr>
           <w:p>
             <w:r>
-              <w:t xml:space="preserve">Asteroid or bullet leaves the current render window bounds </w:t>
+              <w:t xml:space="preserve">Asteroid or bullet leaves the current </w:t>
+            </w:r>
+            <w:r>
+              <w:lastRenderedPageBreak/>
+              <w:t xml:space="preserve">render window bounds </w:t>
             </w:r>
           </w:p>
         </w:tc>
@@ -2641,13 +3695,18 @@
           </w:tcPr>
           <w:p>
             <w:r>
+              <w:lastRenderedPageBreak/>
               <w:t xml:space="preserve">The asteroid or bullet is </w:t>
             </w:r>
             <w:r>
               <w:t>deactivated</w:t>
             </w:r>
             <w:r>
-              <w:t xml:space="preserve"> and removed from the update and </w:t>
+              <w:t xml:space="preserve"> and removed from the </w:t>
+            </w:r>
+            <w:r>
+              <w:lastRenderedPageBreak/>
+              <w:t xml:space="preserve">update and </w:t>
             </w:r>
             <w:r>
               <w:t>render loops and is no longer able to collide with anything.</w:t>
@@ -2660,7 +3719,12 @@
           </w:tcPr>
           <w:p>
             <w:r>
-              <w:t>The asteroid was removed from the update and render loop and no longer had collision.</w:t>
+              <w:lastRenderedPageBreak/>
+              <w:t xml:space="preserve">The asteroid was removed from the update and render </w:t>
+            </w:r>
+            <w:r>
+              <w:lastRenderedPageBreak/>
+              <w:t>loop and no longer had collision.</w:t>
             </w:r>
           </w:p>
           <w:p/>
@@ -2676,43 +3740,63 @@
           </w:tcPr>
           <w:p>
             <w:r>
+              <w:lastRenderedPageBreak/>
               <w:t>No action required.</w:t>
             </w:r>
           </w:p>
+        </w:tc>
+      </w:tr>
+      <w:tr>
+        <w:tc>
+          <w:tcPr>
+            <w:tcW w:w="2254" w:type="dxa"/>
+          </w:tcPr>
+          <w:p>
+            <w:r>
+              <w:t>Two objects with circle hitboxes intersect with each other</w:t>
+            </w:r>
+          </w:p>
+        </w:tc>
+        <w:tc>
+          <w:tcPr>
+            <w:tcW w:w="2254" w:type="dxa"/>
+          </w:tcPr>
+          <w:p>
+            <w:r>
+              <w:t>Collision should be detected and a app</w:t>
+            </w:r>
+            <w:r>
+              <w:t>ropriate outcome should occur.</w:t>
+            </w:r>
+          </w:p>
+        </w:tc>
+        <w:tc>
+          <w:tcPr>
+            <w:tcW w:w="2254" w:type="dxa"/>
+          </w:tcPr>
+          <w:p/>
+        </w:tc>
+        <w:tc>
+          <w:tcPr>
+            <w:tcW w:w="2254" w:type="dxa"/>
+          </w:tcPr>
+          <w:p/>
         </w:tc>
       </w:tr>
     </w:tbl>
-    <w:p/>
-    <w:p/>
-    <w:p/>
-    <w:p/>
-    <w:p/>
     <w:p/>
     <w:p>
       <w:pPr>
         <w:pStyle w:val="Heading1"/>
       </w:pPr>
     </w:p>
+    <w:p/>
     <w:p>
       <w:pPr>
         <w:pStyle w:val="Heading1"/>
       </w:pPr>
-    </w:p>
-    <w:p>
-      <w:pPr>
-        <w:pStyle w:val="Heading1"/>
-      </w:pPr>
-    </w:p>
-    <w:p>
-      <w:pPr>
-        <w:pStyle w:val="Heading1"/>
-      </w:pPr>
-    </w:p>
-    <w:p>
-      <w:pPr>
-        <w:pStyle w:val="Heading1"/>
-      </w:pPr>
-      <w:r>
+      <w:r>
+        <w:lastRenderedPageBreak/>
         <w:t>GiT commit log</w:t>
       </w:r>
     </w:p>
@@ -2782,8 +3866,12 @@
       <w:pPr>
         <w:pStyle w:val="Heading1"/>
       </w:pPr>
-      <w:r>
-        <w:lastRenderedPageBreak/>
+    </w:p>
+    <w:p>
+      <w:pPr>
+        <w:pStyle w:val="Heading1"/>
+      </w:pPr>
+      <w:r>
         <w:t>Schedule</w:t>
       </w:r>
     </w:p>
@@ -2825,15 +3913,13 @@
             <w:pPr>
               <w:rPr>
                 <w:b/>
-                <w:i/>
-                <w:color w:val="FF0000"/>
+                <w:iCs/>
               </w:rPr>
             </w:pPr>
             <w:r>
               <w:rPr>
                 <w:b/>
-                <w:i/>
-                <w:color w:val="FF0000"/>
+                <w:iCs/>
               </w:rPr>
               <w:t>Task</w:t>
             </w:r>
@@ -2847,15 +3933,13 @@
             <w:pPr>
               <w:rPr>
                 <w:b/>
-                <w:i/>
-                <w:color w:val="FF0000"/>
+                <w:iCs/>
               </w:rPr>
             </w:pPr>
             <w:r>
               <w:rPr>
                 <w:b/>
-                <w:i/>
-                <w:color w:val="FF0000"/>
+                <w:iCs/>
               </w:rPr>
               <w:t>Estimated Hrs</w:t>
             </w:r>
@@ -2869,15 +3953,13 @@
             <w:pPr>
               <w:rPr>
                 <w:b/>
-                <w:i/>
-                <w:color w:val="FF0000"/>
+                <w:iCs/>
               </w:rPr>
             </w:pPr>
             <w:r>
               <w:rPr>
                 <w:b/>
-                <w:i/>
-                <w:color w:val="FF0000"/>
+                <w:iCs/>
               </w:rPr>
               <w:t>Actual Hrs</w:t>
             </w:r>
@@ -2892,14 +3974,12 @@
           <w:p>
             <w:pPr>
               <w:rPr>
-                <w:i/>
-                <w:color w:val="FF0000"/>
+                <w:iCs/>
               </w:rPr>
             </w:pPr>
             <w:r>
               <w:rPr>
-                <w:i/>
-                <w:color w:val="FF0000"/>
+                <w:iCs/>
               </w:rPr>
               <w:t>Spec</w:t>
             </w:r>
@@ -2912,16 +3992,14 @@
           <w:p>
             <w:pPr>
               <w:rPr>
-                <w:i/>
-                <w:color w:val="FF0000"/>
+                <w:iCs/>
               </w:rPr>
             </w:pPr>
             <w:r>
               <w:rPr>
-                <w:i/>
-                <w:color w:val="FF0000"/>
-              </w:rPr>
-              <w:t>0.25</w:t>
+                <w:iCs/>
+              </w:rPr>
+              <w:t>1</w:t>
             </w:r>
           </w:p>
         </w:tc>
@@ -2932,16 +4010,14 @@
           <w:p>
             <w:pPr>
               <w:rPr>
-                <w:i/>
-                <w:color w:val="FF0000"/>
+                <w:iCs/>
               </w:rPr>
             </w:pPr>
             <w:r>
               <w:rPr>
-                <w:i/>
-                <w:color w:val="FF0000"/>
-              </w:rPr>
-              <w:t>0.25</w:t>
+                <w:iCs/>
+              </w:rPr>
+              <w:t>1.5</w:t>
             </w:r>
           </w:p>
         </w:tc>
@@ -2954,14 +4030,12 @@
           <w:p>
             <w:pPr>
               <w:rPr>
-                <w:i/>
-                <w:color w:val="FF0000"/>
+                <w:iCs/>
               </w:rPr>
             </w:pPr>
             <w:r>
               <w:rPr>
-                <w:i/>
-                <w:color w:val="FF0000"/>
+                <w:iCs/>
               </w:rPr>
               <w:t>Design</w:t>
             </w:r>
@@ -2974,16 +4048,14 @@
           <w:p>
             <w:pPr>
               <w:rPr>
-                <w:i/>
-                <w:color w:val="FF0000"/>
+                <w:iCs/>
               </w:rPr>
             </w:pPr>
             <w:r>
               <w:rPr>
-                <w:i/>
-                <w:color w:val="FF0000"/>
-              </w:rPr>
-              <w:t>0.5</w:t>
+                <w:iCs/>
+              </w:rPr>
+              <w:t>3</w:t>
             </w:r>
           </w:p>
         </w:tc>
@@ -2994,16 +4066,14 @@
           <w:p>
             <w:pPr>
               <w:rPr>
-                <w:i/>
-                <w:color w:val="FF0000"/>
+                <w:iCs/>
               </w:rPr>
             </w:pPr>
             <w:r>
               <w:rPr>
-                <w:i/>
-                <w:color w:val="FF0000"/>
-              </w:rPr>
-              <w:t>0.25</w:t>
+                <w:iCs/>
+              </w:rPr>
+              <w:t>5</w:t>
             </w:r>
           </w:p>
         </w:tc>
@@ -3016,14 +4086,12 @@
           <w:p>
             <w:pPr>
               <w:rPr>
-                <w:i/>
-                <w:color w:val="FF0000"/>
+                <w:iCs/>
               </w:rPr>
             </w:pPr>
             <w:r>
               <w:rPr>
-                <w:i/>
-                <w:color w:val="FF0000"/>
+                <w:iCs/>
               </w:rPr>
               <w:t>Implement</w:t>
             </w:r>
@@ -3036,16 +4104,14 @@
           <w:p>
             <w:pPr>
               <w:rPr>
-                <w:i/>
-                <w:color w:val="FF0000"/>
+                <w:iCs/>
               </w:rPr>
             </w:pPr>
             <w:r>
               <w:rPr>
-                <w:i/>
-                <w:color w:val="FF0000"/>
-              </w:rPr>
-              <w:t>3</w:t>
+                <w:iCs/>
+              </w:rPr>
+              <w:t>6</w:t>
             </w:r>
           </w:p>
         </w:tc>
@@ -3056,16 +4122,14 @@
           <w:p>
             <w:pPr>
               <w:rPr>
-                <w:i/>
-                <w:color w:val="FF0000"/>
+                <w:iCs/>
               </w:rPr>
             </w:pPr>
             <w:r>
               <w:rPr>
-                <w:i/>
-                <w:color w:val="FF0000"/>
-              </w:rPr>
-              <w:t>2.5</w:t>
+                <w:iCs/>
+              </w:rPr>
+              <w:t>9</w:t>
             </w:r>
           </w:p>
         </w:tc>
@@ -3078,14 +4142,12 @@
           <w:p>
             <w:pPr>
               <w:rPr>
-                <w:i/>
-                <w:color w:val="FF0000"/>
+                <w:iCs/>
               </w:rPr>
             </w:pPr>
             <w:r>
               <w:rPr>
-                <w:i/>
-                <w:color w:val="FF0000"/>
+                <w:iCs/>
               </w:rPr>
               <w:t>Debug and test</w:t>
             </w:r>
@@ -3098,16 +4160,14 @@
           <w:p>
             <w:pPr>
               <w:rPr>
-                <w:i/>
-                <w:color w:val="FF0000"/>
+                <w:iCs/>
               </w:rPr>
             </w:pPr>
             <w:r>
               <w:rPr>
-                <w:i/>
-                <w:color w:val="FF0000"/>
-              </w:rPr>
-              <w:t>0.25</w:t>
+                <w:iCs/>
+              </w:rPr>
+              <w:t>2</w:t>
             </w:r>
           </w:p>
         </w:tc>
@@ -3118,14 +4178,12 @@
           <w:p>
             <w:pPr>
               <w:rPr>
-                <w:i/>
-                <w:color w:val="FF0000"/>
+                <w:iCs/>
               </w:rPr>
             </w:pPr>
             <w:r>
               <w:rPr>
-                <w:i/>
-                <w:color w:val="FF0000"/>
+                <w:iCs/>
               </w:rPr>
               <w:t>3.5</w:t>
             </w:r>
@@ -3139,17 +4197,18 @@
           </w:tcPr>
           <w:p>
             <w:pPr>
-              <w:rPr>
-                <w:i/>
-                <w:color w:val="FF0000"/>
+              <w:jc w:val="right"/>
+              <w:rPr>
+                <w:b/>
+                <w:iCs/>
               </w:rPr>
             </w:pPr>
             <w:r>
               <w:rPr>
-                <w:i/>
-                <w:color w:val="FF0000"/>
-              </w:rPr>
-              <w:t>Slack</w:t>
+                <w:b/>
+                <w:iCs/>
+              </w:rPr>
+              <w:t>total</w:t>
             </w:r>
           </w:p>
         </w:tc>
@@ -3160,16 +4219,16 @@
           <w:p>
             <w:pPr>
               <w:rPr>
-                <w:i/>
-                <w:color w:val="FF0000"/>
+                <w:b/>
+                <w:iCs/>
               </w:rPr>
             </w:pPr>
             <w:r>
               <w:rPr>
-                <w:i/>
-                <w:color w:val="FF0000"/>
-              </w:rPr>
-              <w:t>1</w:t>
+                <w:b/>
+                <w:iCs/>
+              </w:rPr>
+              <w:t>12</w:t>
             </w:r>
           </w:p>
         </w:tc>
@@ -3180,76 +4239,8 @@
           <w:p>
             <w:pPr>
               <w:rPr>
-                <w:i/>
-                <w:color w:val="FF0000"/>
-              </w:rPr>
-            </w:pPr>
-            <w:r>
-              <w:rPr>
-                <w:i/>
-                <w:color w:val="FF0000"/>
-              </w:rPr>
-              <w:t>0</w:t>
-            </w:r>
-          </w:p>
-        </w:tc>
-      </w:tr>
-      <w:tr>
-        <w:tc>
-          <w:tcPr>
-            <w:tcW w:w="2254" w:type="dxa"/>
-          </w:tcPr>
-          <w:p>
-            <w:pPr>
-              <w:jc w:val="right"/>
-              <w:rPr>
                 <w:b/>
-                <w:i/>
-                <w:color w:val="FF0000"/>
-              </w:rPr>
-            </w:pPr>
-            <w:r>
-              <w:rPr>
-                <w:b/>
-                <w:i/>
-                <w:color w:val="FF0000"/>
-              </w:rPr>
-              <w:t>total</w:t>
-            </w:r>
-          </w:p>
-        </w:tc>
-        <w:tc>
-          <w:tcPr>
-            <w:tcW w:w="2254" w:type="dxa"/>
-          </w:tcPr>
-          <w:p>
-            <w:pPr>
-              <w:rPr>
-                <w:b/>
-                <w:i/>
-                <w:color w:val="FF0000"/>
-              </w:rPr>
-            </w:pPr>
-            <w:r>
-              <w:rPr>
-                <w:b/>
-                <w:i/>
-                <w:color w:val="FF0000"/>
-              </w:rPr>
-              <w:t>5</w:t>
-            </w:r>
-          </w:p>
-        </w:tc>
-        <w:tc>
-          <w:tcPr>
-            <w:tcW w:w="2254" w:type="dxa"/>
-          </w:tcPr>
-          <w:p>
-            <w:pPr>
-              <w:rPr>
-                <w:b/>
-                <w:i/>
-                <w:color w:val="FF0000"/>
+                <w:iCs/>
               </w:rPr>
             </w:pPr>
             <w:bookmarkStart w:id="0" w:name="_heading=h.gjdgxs" w:colFirst="0" w:colLast="0"/>
@@ -3257,10 +4248,9 @@
             <w:r>
               <w:rPr>
                 <w:b/>
-                <w:i/>
-                <w:color w:val="FF0000"/>
-              </w:rPr>
-              <w:t>6.5</w:t>
+                <w:iCs/>
+              </w:rPr>
+              <w:t>19</w:t>
             </w:r>
           </w:p>
         </w:tc>
@@ -3269,8 +4259,7 @@
     <w:p>
       <w:pPr>
         <w:rPr>
-          <w:i/>
-          <w:color w:val="FF0000"/>
+          <w:iCs/>
         </w:rPr>
       </w:pPr>
     </w:p>

</xml_diff>